<commit_message>
documentacion: actualizar informe IEEE 830 con requisitos y factibilidad
</commit_message>
<xml_diff>
--- a/docs/Informe_Mesa_de_Ayuda.docx
+++ b/docs/Informe_Mesa_de_Ayuda.docx
@@ -892,11 +892,9 @@
       <w:r>
         <w:t xml:space="preserve"> </w:t>
       </w:r>
-      <w:proofErr w:type="gramStart"/>
-      <w:r>
-        <w:t>Responsable</w:t>
-      </w:r>
-      <w:proofErr w:type="gramEnd"/>
+      <w:r>
+        <w:t>responsable</w:t>
+      </w:r>
       <w:r>
         <w:t xml:space="preserve"> técnico de la resolución. Visualiza las solicitudes asignadas a su departamento, cambia el estado a </w:t>
       </w:r>
@@ -1022,11 +1020,9 @@
       <w:r>
         <w:t xml:space="preserve"> Un usuario no puede poseer múltiples perfiles asignados simultáneamente (ej. no se puede ser </w:t>
       </w:r>
-      <w:proofErr w:type="gramStart"/>
-      <w:r>
-        <w:t>Jefe</w:t>
-      </w:r>
-      <w:proofErr w:type="gramEnd"/>
+      <w:r>
+        <w:t>jefe</w:t>
+      </w:r>
       <w:r>
         <w:t xml:space="preserve"> de Mesa y Ejecutivo a la vez).</w:t>
       </w:r>
@@ -1086,6 +1082,531 @@
         <w:t>La infraestructura de red local de la consultora cuenta con conectividad estable para el acceso web.</w:t>
       </w:r>
     </w:p>
+    <w:p/>
+    <w:p/>
+    <w:p/>
+    <w:p>
+      <w:pPr>
+        <w:rPr>
+          <w:b/>
+          <w:bCs/>
+        </w:rPr>
+      </w:pPr>
+      <w:r>
+        <w:rPr>
+          <w:b/>
+          <w:bCs/>
+        </w:rPr>
+        <w:lastRenderedPageBreak/>
+        <w:t>3. REQUISITOS ESPECÍFICOS PRELIMINARES</w:t>
+      </w:r>
+    </w:p>
+    <w:p>
+      <w:pPr>
+        <w:rPr>
+          <w:b/>
+          <w:bCs/>
+        </w:rPr>
+      </w:pPr>
+      <w:r>
+        <w:rPr>
+          <w:b/>
+          <w:bCs/>
+        </w:rPr>
+        <w:t>3.1 Requisitos Funcionales (RF)</w:t>
+      </w:r>
+    </w:p>
+    <w:p>
+      <w:pPr>
+        <w:numPr>
+          <w:ilvl w:val="0"/>
+          <w:numId w:val="9"/>
+        </w:numPr>
+      </w:pPr>
+      <w:r>
+        <w:rPr>
+          <w:b/>
+          <w:bCs/>
+        </w:rPr>
+        <w:t>RF-01 (Creación de Tique):</w:t>
+      </w:r>
+      <w:r>
+        <w:t xml:space="preserve"> El sistema debe permitir a los ejecutivos de la mesa de ayuda registrar un nuevo tique ingresando obligatoriamente: Nombre del cliente, RUT, teléfono, correo electrónico, tipo de tique (felicitación, consulta, reclamo, problema), nivel de criticidad, detalle del servicio, detalle del problema y área a derivar.</w:t>
+      </w:r>
+    </w:p>
+    <w:p>
+      <w:pPr>
+        <w:numPr>
+          <w:ilvl w:val="0"/>
+          <w:numId w:val="9"/>
+        </w:numPr>
+      </w:pPr>
+      <w:r>
+        <w:rPr>
+          <w:b/>
+          <w:bCs/>
+        </w:rPr>
+        <w:t>RF-02 (Asignación de Creador):</w:t>
+      </w:r>
+      <w:r>
+        <w:t xml:space="preserve"> El sistema debe asociar de forma automática cada tique al ejecutivo que inició la toma del requerimiento.</w:t>
+      </w:r>
+    </w:p>
+    <w:p>
+      <w:pPr>
+        <w:numPr>
+          <w:ilvl w:val="0"/>
+          <w:numId w:val="9"/>
+        </w:numPr>
+      </w:pPr>
+      <w:r>
+        <w:rPr>
+          <w:b/>
+          <w:bCs/>
+        </w:rPr>
+        <w:t>RF-03 (Derivación y Estado Inicial):</w:t>
+      </w:r>
+      <w:r>
+        <w:t xml:space="preserve"> Al asignar el tique a un área específica para su resolución, el sistema debe cambiar su estado automáticamente a </w:t>
+      </w:r>
+      <w:r>
+        <w:rPr>
+          <w:b/>
+          <w:bCs/>
+        </w:rPr>
+        <w:t>"A resolución"</w:t>
+      </w:r>
+      <w:r>
+        <w:t>.</w:t>
+      </w:r>
+    </w:p>
+    <w:p>
+      <w:pPr>
+        <w:numPr>
+          <w:ilvl w:val="0"/>
+          <w:numId w:val="9"/>
+        </w:numPr>
+      </w:pPr>
+      <w:r>
+        <w:rPr>
+          <w:b/>
+          <w:bCs/>
+        </w:rPr>
+        <w:t>RF-04 (Resolución por Área):</w:t>
+      </w:r>
+      <w:r>
+        <w:t xml:space="preserve"> Un ejecutivo perteneciente al área asignada debe poder visualizar el tique y cambiar su estado a </w:t>
+      </w:r>
+      <w:r>
+        <w:rPr>
+          <w:b/>
+          <w:bCs/>
+        </w:rPr>
+        <w:t>"Resuelto"</w:t>
+      </w:r>
+      <w:r>
+        <w:t xml:space="preserve"> o </w:t>
+      </w:r>
+      <w:r>
+        <w:rPr>
+          <w:b/>
+          <w:bCs/>
+        </w:rPr>
+        <w:t>"No aplicable"</w:t>
+      </w:r>
+      <w:r>
+        <w:t>.</w:t>
+      </w:r>
+    </w:p>
+    <w:p>
+      <w:pPr>
+        <w:numPr>
+          <w:ilvl w:val="0"/>
+          <w:numId w:val="9"/>
+        </w:numPr>
+      </w:pPr>
+      <w:r>
+        <w:rPr>
+          <w:b/>
+          <w:bCs/>
+        </w:rPr>
+        <w:t>RF-05 (Cierre y Observación):</w:t>
+      </w:r>
+      <w:r>
+        <w:t xml:space="preserve"> El ejecutivo de área específica debe ingresar obligatoriamente una observación antes de proceder al cierre definitivo del tique.</w:t>
+      </w:r>
+    </w:p>
+    <w:p>
+      <w:pPr>
+        <w:numPr>
+          <w:ilvl w:val="0"/>
+          <w:numId w:val="9"/>
+        </w:numPr>
+      </w:pPr>
+      <w:r>
+        <w:rPr>
+          <w:b/>
+          <w:bCs/>
+        </w:rPr>
+        <w:t>RF-06 (Trazabilidad de Usuarios):</w:t>
+      </w:r>
+      <w:r>
+        <w:t xml:space="preserve"> El sistema debe guardar el registro del usuario que creó el tique y del usuario que lo cerró.</w:t>
+      </w:r>
+    </w:p>
+    <w:p>
+      <w:pPr>
+        <w:numPr>
+          <w:ilvl w:val="0"/>
+          <w:numId w:val="9"/>
+        </w:numPr>
+      </w:pPr>
+      <w:r>
+        <w:rPr>
+          <w:b/>
+          <w:bCs/>
+        </w:rPr>
+        <w:t>RF-07 (Autenticación y Perfiles):</w:t>
+      </w:r>
+      <w:r>
+        <w:t xml:space="preserve"> El sistema debe solicitar usuario y contraseña. Al ingresar, debe identificar automáticamente el perfil del usuario y desplegar la interfaz según sus permisos.</w:t>
+      </w:r>
+    </w:p>
+    <w:p>
+      <w:pPr>
+        <w:numPr>
+          <w:ilvl w:val="0"/>
+          <w:numId w:val="9"/>
+        </w:numPr>
+      </w:pPr>
+      <w:r>
+        <w:rPr>
+          <w:b/>
+          <w:bCs/>
+        </w:rPr>
+        <w:t>RF-08 (Previsualización de Tique):</w:t>
+      </w:r>
+      <w:r>
+        <w:t xml:space="preserve"> Tras crear un tique, el sistema debe mostrar una pantalla de resumen con los campos ingresados a modo de confirmación (sin requerir impresión física).</w:t>
+      </w:r>
+    </w:p>
+    <w:p>
+      <w:pPr>
+        <w:numPr>
+          <w:ilvl w:val="0"/>
+          <w:numId w:val="9"/>
+        </w:numPr>
+      </w:pPr>
+      <w:r>
+        <w:rPr>
+          <w:b/>
+          <w:bCs/>
+        </w:rPr>
+        <w:t xml:space="preserve">RF-09 (Filtros y Consultas para </w:t>
+      </w:r>
+      <w:r>
+        <w:rPr>
+          <w:b/>
+          <w:bCs/>
+        </w:rPr>
+        <w:t>jefe</w:t>
+      </w:r>
+      <w:r>
+        <w:rPr>
+          <w:b/>
+          <w:bCs/>
+        </w:rPr>
+        <w:t xml:space="preserve"> de Mesa):</w:t>
+      </w:r>
+      <w:r>
+        <w:t xml:space="preserve"> El </w:t>
+      </w:r>
+      <w:r>
+        <w:t>jefe</w:t>
+      </w:r>
+      <w:r>
+        <w:t xml:space="preserve"> de Mesa debe poder listar los tiques creados filtrando por: fecha específica, criticidad, tipo, ejecutivo que abre, ejecutivo que cierra y área.</w:t>
+      </w:r>
+    </w:p>
+    <w:p>
+      <w:pPr>
+        <w:numPr>
+          <w:ilvl w:val="0"/>
+          <w:numId w:val="9"/>
+        </w:numPr>
+      </w:pPr>
+      <w:r>
+        <w:rPr>
+          <w:b/>
+          <w:bCs/>
+        </w:rPr>
+        <w:t>RF-10 (Vista Tabular de Tiques):</w:t>
+      </w:r>
+      <w:r>
+        <w:t xml:space="preserve"> La lista de tiques del </w:t>
+      </w:r>
+      <w:r>
+        <w:t>jefe</w:t>
+      </w:r>
+      <w:r>
+        <w:t xml:space="preserve"> de Mesa debe presentarse en una tabla con: Nombre del ejecutivo creador, fecha de creación, tipo de tique, criticidad, área de destino y estado.</w:t>
+      </w:r>
+    </w:p>
+    <w:p>
+      <w:pPr>
+        <w:numPr>
+          <w:ilvl w:val="0"/>
+          <w:numId w:val="9"/>
+        </w:numPr>
+      </w:pPr>
+      <w:r>
+        <w:rPr>
+          <w:b/>
+          <w:bCs/>
+        </w:rPr>
+        <w:lastRenderedPageBreak/>
+        <w:t>RF-11 (Gestión de Mantenedores):</w:t>
+      </w:r>
+      <w:r>
+        <w:t xml:space="preserve"> El </w:t>
+      </w:r>
+      <w:r>
+        <w:t>jefe</w:t>
+      </w:r>
+      <w:r>
+        <w:t xml:space="preserve"> de Mesa debe poder crear nuevos ejecutivos/usuarios, así como crear y editar áreas, tipos de tique y criticidades.</w:t>
+      </w:r>
+    </w:p>
+    <w:p>
+      <w:pPr>
+        <w:rPr>
+          <w:b/>
+          <w:bCs/>
+        </w:rPr>
+      </w:pPr>
+      <w:r>
+        <w:rPr>
+          <w:b/>
+          <w:bCs/>
+        </w:rPr>
+        <w:t>3.2 Requisitos No Funcionales (RNF)</w:t>
+      </w:r>
+    </w:p>
+    <w:p>
+      <w:pPr>
+        <w:numPr>
+          <w:ilvl w:val="0"/>
+          <w:numId w:val="10"/>
+        </w:numPr>
+      </w:pPr>
+      <w:r>
+        <w:rPr>
+          <w:b/>
+          <w:bCs/>
+        </w:rPr>
+        <w:t>RNF-01 (Usabilidad):</w:t>
+      </w:r>
+      <w:r>
+        <w:t xml:space="preserve"> La interfaz debe ser intuitiva y centralizada para agilizar el registro respecto al flujo anterior en Excel.</w:t>
+      </w:r>
+    </w:p>
+    <w:p>
+      <w:pPr>
+        <w:numPr>
+          <w:ilvl w:val="0"/>
+          <w:numId w:val="10"/>
+        </w:numPr>
+      </w:pPr>
+      <w:r>
+        <w:rPr>
+          <w:b/>
+          <w:bCs/>
+        </w:rPr>
+        <w:t>RNF-02 (Seguridad):</w:t>
+      </w:r>
+      <w:r>
+        <w:t xml:space="preserve"> Las contraseñas deben almacenarse de forma cifrada en la base de datos y controlar los accesos según roles.</w:t>
+      </w:r>
+    </w:p>
+    <w:p>
+      <w:pPr>
+        <w:numPr>
+          <w:ilvl w:val="0"/>
+          <w:numId w:val="10"/>
+        </w:numPr>
+      </w:pPr>
+      <w:r>
+        <w:rPr>
+          <w:b/>
+          <w:bCs/>
+        </w:rPr>
+        <w:t>RNF-03 (Disponibilidad):</w:t>
+      </w:r>
+      <w:r>
+        <w:t xml:space="preserve"> El sistema web debe estar accesible para la red corporativa durante la jornada operativa de la consultora.</w:t>
+      </w:r>
+    </w:p>
+    <w:p>
+      <w:pPr>
+        <w:rPr>
+          <w:b/>
+          <w:bCs/>
+        </w:rPr>
+      </w:pPr>
+      <w:r>
+        <w:rPr>
+          <w:b/>
+          <w:bCs/>
+        </w:rPr>
+        <w:t>4. REGLAS DE NEGOCIO (RN)</w:t>
+      </w:r>
+    </w:p>
+    <w:p>
+      <w:pPr>
+        <w:numPr>
+          <w:ilvl w:val="0"/>
+          <w:numId w:val="11"/>
+        </w:numPr>
+      </w:pPr>
+      <w:r>
+        <w:rPr>
+          <w:b/>
+          <w:bCs/>
+        </w:rPr>
+        <w:t>RN-01 (Exclusividad de Perfiles):</w:t>
+      </w:r>
+      <w:r>
+        <w:t xml:space="preserve"> No existen usuarios con múltiples roles. Un usuario es </w:t>
+      </w:r>
+      <w:proofErr w:type="spellStart"/>
+      <w:r>
+        <w:t>strictly</w:t>
+      </w:r>
+      <w:proofErr w:type="spellEnd"/>
+      <w:r>
+        <w:t xml:space="preserve"> </w:t>
+      </w:r>
+      <w:r>
+        <w:t>jefe</w:t>
+      </w:r>
+      <w:r>
+        <w:t xml:space="preserve"> de Mesa o Ejecutivo (Mesa/Área).</w:t>
+      </w:r>
+    </w:p>
+    <w:p>
+      <w:pPr>
+        <w:numPr>
+          <w:ilvl w:val="0"/>
+          <w:numId w:val="11"/>
+        </w:numPr>
+      </w:pPr>
+      <w:r>
+        <w:rPr>
+          <w:b/>
+          <w:bCs/>
+        </w:rPr>
+        <w:t>RN-02 (Desactivación de Usuarios):</w:t>
+      </w:r>
+      <w:r>
+        <w:t xml:space="preserve"> La eliminación de un usuario no debe borrar los tiques que este haya creado o cerrado; únicamente desactivará su acceso al sistema.</w:t>
+      </w:r>
+    </w:p>
+    <w:p>
+      <w:pPr>
+        <w:numPr>
+          <w:ilvl w:val="0"/>
+          <w:numId w:val="11"/>
+        </w:numPr>
+      </w:pPr>
+      <w:r>
+        <w:rPr>
+          <w:b/>
+          <w:bCs/>
+        </w:rPr>
+        <w:t>RN-03 (Protección de Mantenedores en Uso):</w:t>
+      </w:r>
+      <w:r>
+        <w:t xml:space="preserve"> El </w:t>
+      </w:r>
+      <w:r>
+        <w:t>jefe</w:t>
+      </w:r>
+      <w:r>
+        <w:t xml:space="preserve"> de Mesa no podrá eliminar áreas, tipos de tique o criticidades si existen tiques asociados a ellos en el historial.</w:t>
+      </w:r>
+    </w:p>
+    <w:p>
+      <w:pPr>
+        <w:rPr>
+          <w:b/>
+          <w:bCs/>
+        </w:rPr>
+      </w:pPr>
+      <w:r>
+        <w:rPr>
+          <w:b/>
+          <w:bCs/>
+        </w:rPr>
+        <w:t>5. ANÁLISIS INICIAL DE FACTIBILIDAD</w:t>
+      </w:r>
+    </w:p>
+    <w:p>
+      <w:pPr>
+        <w:rPr>
+          <w:b/>
+          <w:bCs/>
+        </w:rPr>
+      </w:pPr>
+      <w:r>
+        <w:rPr>
+          <w:b/>
+          <w:bCs/>
+        </w:rPr>
+        <w:t>5.1 Factibilidad Técnica</w:t>
+      </w:r>
+    </w:p>
+    <w:p>
+      <w:r>
+        <w:t>El desarrollo de la plataforma web es completamente viable utilizando arquitecturas web estándar (</w:t>
+      </w:r>
+      <w:proofErr w:type="spellStart"/>
+      <w:r>
+        <w:t>Frontend</w:t>
+      </w:r>
+      <w:proofErr w:type="spellEnd"/>
+      <w:r>
+        <w:t xml:space="preserve"> dinámico, </w:t>
+      </w:r>
+      <w:proofErr w:type="spellStart"/>
+      <w:r>
+        <w:t>Backend</w:t>
+      </w:r>
+      <w:proofErr w:type="spellEnd"/>
+      <w:r>
+        <w:t xml:space="preserve"> transaccional y Base de Datos relacional). Reemplaza eficientemente el uso de planillas Excel sin requerir hardware especializado en las estaciones de trabajo.</w:t>
+      </w:r>
+    </w:p>
+    <w:p>
+      <w:pPr>
+        <w:rPr>
+          <w:b/>
+          <w:bCs/>
+        </w:rPr>
+      </w:pPr>
+      <w:r>
+        <w:rPr>
+          <w:b/>
+          <w:bCs/>
+        </w:rPr>
+        <w:t>5.2 Factibilidad de Negocio</w:t>
+      </w:r>
+    </w:p>
+    <w:p>
+      <w:r>
+        <w:t>La implementación reduce drásticamente los tiempos de consolidación de información de la consultora "Consúltenos", elimina la pérdida de trazabilidad entre departamentos y entrega herramientas de supervisión directa a la jefatura.</w:t>
+      </w:r>
+    </w:p>
+    <w:p/>
     <w:sectPr>
       <w:pgSz w:w="12240" w:h="15840"/>
       <w:pgMar w:top="1417" w:right="1701" w:bottom="1417" w:left="1701" w:header="708" w:footer="708" w:gutter="0"/>
@@ -1397,6 +1918,155 @@
     </w:lvl>
   </w:abstractNum>
   <w:abstractNum w:abstractNumId="2" w15:restartNumberingAfterBreak="0">
+    <w:nsid w:val="2B6F0DBF"/>
+    <w:multiLevelType w:val="multilevel"/>
+    <w:tmpl w:val="09F8C922"/>
+    <w:lvl w:ilvl="0">
+      <w:start w:val="1"/>
+      <w:numFmt w:val="bullet"/>
+      <w:lvlText w:val=""/>
+      <w:lvlJc w:val="left"/>
+      <w:pPr>
+        <w:tabs>
+          <w:tab w:val="num" w:pos="720"/>
+        </w:tabs>
+        <w:ind w:left="720" w:hanging="360"/>
+      </w:pPr>
+      <w:rPr>
+        <w:rFonts w:ascii="Symbol" w:hAnsi="Symbol" w:hint="default"/>
+        <w:sz w:val="20"/>
+      </w:rPr>
+    </w:lvl>
+    <w:lvl w:ilvl="1" w:tentative="1">
+      <w:start w:val="1"/>
+      <w:numFmt w:val="bullet"/>
+      <w:lvlText w:val="o"/>
+      <w:lvlJc w:val="left"/>
+      <w:pPr>
+        <w:tabs>
+          <w:tab w:val="num" w:pos="1440"/>
+        </w:tabs>
+        <w:ind w:left="1440" w:hanging="360"/>
+      </w:pPr>
+      <w:rPr>
+        <w:rFonts w:ascii="Courier New" w:hAnsi="Courier New" w:hint="default"/>
+        <w:sz w:val="20"/>
+      </w:rPr>
+    </w:lvl>
+    <w:lvl w:ilvl="2" w:tentative="1">
+      <w:start w:val="1"/>
+      <w:numFmt w:val="bullet"/>
+      <w:lvlText w:val=""/>
+      <w:lvlJc w:val="left"/>
+      <w:pPr>
+        <w:tabs>
+          <w:tab w:val="num" w:pos="2160"/>
+        </w:tabs>
+        <w:ind w:left="2160" w:hanging="360"/>
+      </w:pPr>
+      <w:rPr>
+        <w:rFonts w:ascii="Wingdings" w:hAnsi="Wingdings" w:hint="default"/>
+        <w:sz w:val="20"/>
+      </w:rPr>
+    </w:lvl>
+    <w:lvl w:ilvl="3" w:tentative="1">
+      <w:start w:val="1"/>
+      <w:numFmt w:val="bullet"/>
+      <w:lvlText w:val=""/>
+      <w:lvlJc w:val="left"/>
+      <w:pPr>
+        <w:tabs>
+          <w:tab w:val="num" w:pos="2880"/>
+        </w:tabs>
+        <w:ind w:left="2880" w:hanging="360"/>
+      </w:pPr>
+      <w:rPr>
+        <w:rFonts w:ascii="Wingdings" w:hAnsi="Wingdings" w:hint="default"/>
+        <w:sz w:val="20"/>
+      </w:rPr>
+    </w:lvl>
+    <w:lvl w:ilvl="4" w:tentative="1">
+      <w:start w:val="1"/>
+      <w:numFmt w:val="bullet"/>
+      <w:lvlText w:val=""/>
+      <w:lvlJc w:val="left"/>
+      <w:pPr>
+        <w:tabs>
+          <w:tab w:val="num" w:pos="3600"/>
+        </w:tabs>
+        <w:ind w:left="3600" w:hanging="360"/>
+      </w:pPr>
+      <w:rPr>
+        <w:rFonts w:ascii="Wingdings" w:hAnsi="Wingdings" w:hint="default"/>
+        <w:sz w:val="20"/>
+      </w:rPr>
+    </w:lvl>
+    <w:lvl w:ilvl="5" w:tentative="1">
+      <w:start w:val="1"/>
+      <w:numFmt w:val="bullet"/>
+      <w:lvlText w:val=""/>
+      <w:lvlJc w:val="left"/>
+      <w:pPr>
+        <w:tabs>
+          <w:tab w:val="num" w:pos="4320"/>
+        </w:tabs>
+        <w:ind w:left="4320" w:hanging="360"/>
+      </w:pPr>
+      <w:rPr>
+        <w:rFonts w:ascii="Wingdings" w:hAnsi="Wingdings" w:hint="default"/>
+        <w:sz w:val="20"/>
+      </w:rPr>
+    </w:lvl>
+    <w:lvl w:ilvl="6" w:tentative="1">
+      <w:start w:val="1"/>
+      <w:numFmt w:val="bullet"/>
+      <w:lvlText w:val=""/>
+      <w:lvlJc w:val="left"/>
+      <w:pPr>
+        <w:tabs>
+          <w:tab w:val="num" w:pos="5040"/>
+        </w:tabs>
+        <w:ind w:left="5040" w:hanging="360"/>
+      </w:pPr>
+      <w:rPr>
+        <w:rFonts w:ascii="Wingdings" w:hAnsi="Wingdings" w:hint="default"/>
+        <w:sz w:val="20"/>
+      </w:rPr>
+    </w:lvl>
+    <w:lvl w:ilvl="7" w:tentative="1">
+      <w:start w:val="1"/>
+      <w:numFmt w:val="bullet"/>
+      <w:lvlText w:val=""/>
+      <w:lvlJc w:val="left"/>
+      <w:pPr>
+        <w:tabs>
+          <w:tab w:val="num" w:pos="5760"/>
+        </w:tabs>
+        <w:ind w:left="5760" w:hanging="360"/>
+      </w:pPr>
+      <w:rPr>
+        <w:rFonts w:ascii="Wingdings" w:hAnsi="Wingdings" w:hint="default"/>
+        <w:sz w:val="20"/>
+      </w:rPr>
+    </w:lvl>
+    <w:lvl w:ilvl="8" w:tentative="1">
+      <w:start w:val="1"/>
+      <w:numFmt w:val="bullet"/>
+      <w:lvlText w:val=""/>
+      <w:lvlJc w:val="left"/>
+      <w:pPr>
+        <w:tabs>
+          <w:tab w:val="num" w:pos="6480"/>
+        </w:tabs>
+        <w:ind w:left="6480" w:hanging="360"/>
+      </w:pPr>
+      <w:rPr>
+        <w:rFonts w:ascii="Wingdings" w:hAnsi="Wingdings" w:hint="default"/>
+        <w:sz w:val="20"/>
+      </w:rPr>
+    </w:lvl>
+  </w:abstractNum>
+  <w:abstractNum w:abstractNumId="3" w15:restartNumberingAfterBreak="0">
     <w:nsid w:val="35B22CA4"/>
     <w:multiLevelType w:val="multilevel"/>
     <w:tmpl w:val="9CCE05F0"/>
@@ -1545,7 +2215,156 @@
       </w:rPr>
     </w:lvl>
   </w:abstractNum>
-  <w:abstractNum w:abstractNumId="3" w15:restartNumberingAfterBreak="0">
+  <w:abstractNum w:abstractNumId="4" w15:restartNumberingAfterBreak="0">
+    <w:nsid w:val="3FA978DA"/>
+    <w:multiLevelType w:val="multilevel"/>
+    <w:tmpl w:val="452611AE"/>
+    <w:lvl w:ilvl="0">
+      <w:start w:val="1"/>
+      <w:numFmt w:val="bullet"/>
+      <w:lvlText w:val=""/>
+      <w:lvlJc w:val="left"/>
+      <w:pPr>
+        <w:tabs>
+          <w:tab w:val="num" w:pos="720"/>
+        </w:tabs>
+        <w:ind w:left="720" w:hanging="360"/>
+      </w:pPr>
+      <w:rPr>
+        <w:rFonts w:ascii="Symbol" w:hAnsi="Symbol" w:hint="default"/>
+        <w:sz w:val="20"/>
+      </w:rPr>
+    </w:lvl>
+    <w:lvl w:ilvl="1" w:tentative="1">
+      <w:start w:val="1"/>
+      <w:numFmt w:val="bullet"/>
+      <w:lvlText w:val="o"/>
+      <w:lvlJc w:val="left"/>
+      <w:pPr>
+        <w:tabs>
+          <w:tab w:val="num" w:pos="1440"/>
+        </w:tabs>
+        <w:ind w:left="1440" w:hanging="360"/>
+      </w:pPr>
+      <w:rPr>
+        <w:rFonts w:ascii="Courier New" w:hAnsi="Courier New" w:hint="default"/>
+        <w:sz w:val="20"/>
+      </w:rPr>
+    </w:lvl>
+    <w:lvl w:ilvl="2" w:tentative="1">
+      <w:start w:val="1"/>
+      <w:numFmt w:val="bullet"/>
+      <w:lvlText w:val=""/>
+      <w:lvlJc w:val="left"/>
+      <w:pPr>
+        <w:tabs>
+          <w:tab w:val="num" w:pos="2160"/>
+        </w:tabs>
+        <w:ind w:left="2160" w:hanging="360"/>
+      </w:pPr>
+      <w:rPr>
+        <w:rFonts w:ascii="Wingdings" w:hAnsi="Wingdings" w:hint="default"/>
+        <w:sz w:val="20"/>
+      </w:rPr>
+    </w:lvl>
+    <w:lvl w:ilvl="3" w:tentative="1">
+      <w:start w:val="1"/>
+      <w:numFmt w:val="bullet"/>
+      <w:lvlText w:val=""/>
+      <w:lvlJc w:val="left"/>
+      <w:pPr>
+        <w:tabs>
+          <w:tab w:val="num" w:pos="2880"/>
+        </w:tabs>
+        <w:ind w:left="2880" w:hanging="360"/>
+      </w:pPr>
+      <w:rPr>
+        <w:rFonts w:ascii="Wingdings" w:hAnsi="Wingdings" w:hint="default"/>
+        <w:sz w:val="20"/>
+      </w:rPr>
+    </w:lvl>
+    <w:lvl w:ilvl="4" w:tentative="1">
+      <w:start w:val="1"/>
+      <w:numFmt w:val="bullet"/>
+      <w:lvlText w:val=""/>
+      <w:lvlJc w:val="left"/>
+      <w:pPr>
+        <w:tabs>
+          <w:tab w:val="num" w:pos="3600"/>
+        </w:tabs>
+        <w:ind w:left="3600" w:hanging="360"/>
+      </w:pPr>
+      <w:rPr>
+        <w:rFonts w:ascii="Wingdings" w:hAnsi="Wingdings" w:hint="default"/>
+        <w:sz w:val="20"/>
+      </w:rPr>
+    </w:lvl>
+    <w:lvl w:ilvl="5" w:tentative="1">
+      <w:start w:val="1"/>
+      <w:numFmt w:val="bullet"/>
+      <w:lvlText w:val=""/>
+      <w:lvlJc w:val="left"/>
+      <w:pPr>
+        <w:tabs>
+          <w:tab w:val="num" w:pos="4320"/>
+        </w:tabs>
+        <w:ind w:left="4320" w:hanging="360"/>
+      </w:pPr>
+      <w:rPr>
+        <w:rFonts w:ascii="Wingdings" w:hAnsi="Wingdings" w:hint="default"/>
+        <w:sz w:val="20"/>
+      </w:rPr>
+    </w:lvl>
+    <w:lvl w:ilvl="6" w:tentative="1">
+      <w:start w:val="1"/>
+      <w:numFmt w:val="bullet"/>
+      <w:lvlText w:val=""/>
+      <w:lvlJc w:val="left"/>
+      <w:pPr>
+        <w:tabs>
+          <w:tab w:val="num" w:pos="5040"/>
+        </w:tabs>
+        <w:ind w:left="5040" w:hanging="360"/>
+      </w:pPr>
+      <w:rPr>
+        <w:rFonts w:ascii="Wingdings" w:hAnsi="Wingdings" w:hint="default"/>
+        <w:sz w:val="20"/>
+      </w:rPr>
+    </w:lvl>
+    <w:lvl w:ilvl="7" w:tentative="1">
+      <w:start w:val="1"/>
+      <w:numFmt w:val="bullet"/>
+      <w:lvlText w:val=""/>
+      <w:lvlJc w:val="left"/>
+      <w:pPr>
+        <w:tabs>
+          <w:tab w:val="num" w:pos="5760"/>
+        </w:tabs>
+        <w:ind w:left="5760" w:hanging="360"/>
+      </w:pPr>
+      <w:rPr>
+        <w:rFonts w:ascii="Wingdings" w:hAnsi="Wingdings" w:hint="default"/>
+        <w:sz w:val="20"/>
+      </w:rPr>
+    </w:lvl>
+    <w:lvl w:ilvl="8" w:tentative="1">
+      <w:start w:val="1"/>
+      <w:numFmt w:val="bullet"/>
+      <w:lvlText w:val=""/>
+      <w:lvlJc w:val="left"/>
+      <w:pPr>
+        <w:tabs>
+          <w:tab w:val="num" w:pos="6480"/>
+        </w:tabs>
+        <w:ind w:left="6480" w:hanging="360"/>
+      </w:pPr>
+      <w:rPr>
+        <w:rFonts w:ascii="Wingdings" w:hAnsi="Wingdings" w:hint="default"/>
+        <w:sz w:val="20"/>
+      </w:rPr>
+    </w:lvl>
+  </w:abstractNum>
+  <w:abstractNum w:abstractNumId="5" w15:restartNumberingAfterBreak="0">
     <w:nsid w:val="4042777C"/>
     <w:multiLevelType w:val="multilevel"/>
     <w:tmpl w:val="255A2F10"/>
@@ -1658,7 +2477,7 @@
       </w:pPr>
     </w:lvl>
   </w:abstractNum>
-  <w:abstractNum w:abstractNumId="4" w15:restartNumberingAfterBreak="0">
+  <w:abstractNum w:abstractNumId="6" w15:restartNumberingAfterBreak="0">
     <w:nsid w:val="4D492E31"/>
     <w:multiLevelType w:val="multilevel"/>
     <w:tmpl w:val="A8600EE8"/>
@@ -1807,7 +2626,7 @@
       </w:rPr>
     </w:lvl>
   </w:abstractNum>
-  <w:abstractNum w:abstractNumId="5" w15:restartNumberingAfterBreak="0">
+  <w:abstractNum w:abstractNumId="7" w15:restartNumberingAfterBreak="0">
     <w:nsid w:val="66CD06CA"/>
     <w:multiLevelType w:val="multilevel"/>
     <w:tmpl w:val="59BAADAC"/>
@@ -1956,7 +2775,7 @@
       </w:rPr>
     </w:lvl>
   </w:abstractNum>
-  <w:abstractNum w:abstractNumId="6" w15:restartNumberingAfterBreak="0">
+  <w:abstractNum w:abstractNumId="8" w15:restartNumberingAfterBreak="0">
     <w:nsid w:val="67987A91"/>
     <w:multiLevelType w:val="multilevel"/>
     <w:tmpl w:val="B5F62DDA"/>
@@ -2105,10 +2924,159 @@
       </w:rPr>
     </w:lvl>
   </w:abstractNum>
-  <w:abstractNum w:abstractNumId="7" w15:restartNumberingAfterBreak="0">
+  <w:abstractNum w:abstractNumId="9" w15:restartNumberingAfterBreak="0">
     <w:nsid w:val="6C205D82"/>
     <w:multiLevelType w:val="multilevel"/>
     <w:tmpl w:val="1928832C"/>
+    <w:lvl w:ilvl="0">
+      <w:start w:val="1"/>
+      <w:numFmt w:val="bullet"/>
+      <w:lvlText w:val=""/>
+      <w:lvlJc w:val="left"/>
+      <w:pPr>
+        <w:tabs>
+          <w:tab w:val="num" w:pos="720"/>
+        </w:tabs>
+        <w:ind w:left="720" w:hanging="360"/>
+      </w:pPr>
+      <w:rPr>
+        <w:rFonts w:ascii="Symbol" w:hAnsi="Symbol" w:hint="default"/>
+        <w:sz w:val="20"/>
+      </w:rPr>
+    </w:lvl>
+    <w:lvl w:ilvl="1" w:tentative="1">
+      <w:start w:val="1"/>
+      <w:numFmt w:val="bullet"/>
+      <w:lvlText w:val="o"/>
+      <w:lvlJc w:val="left"/>
+      <w:pPr>
+        <w:tabs>
+          <w:tab w:val="num" w:pos="1440"/>
+        </w:tabs>
+        <w:ind w:left="1440" w:hanging="360"/>
+      </w:pPr>
+      <w:rPr>
+        <w:rFonts w:ascii="Courier New" w:hAnsi="Courier New" w:hint="default"/>
+        <w:sz w:val="20"/>
+      </w:rPr>
+    </w:lvl>
+    <w:lvl w:ilvl="2" w:tentative="1">
+      <w:start w:val="1"/>
+      <w:numFmt w:val="bullet"/>
+      <w:lvlText w:val=""/>
+      <w:lvlJc w:val="left"/>
+      <w:pPr>
+        <w:tabs>
+          <w:tab w:val="num" w:pos="2160"/>
+        </w:tabs>
+        <w:ind w:left="2160" w:hanging="360"/>
+      </w:pPr>
+      <w:rPr>
+        <w:rFonts w:ascii="Wingdings" w:hAnsi="Wingdings" w:hint="default"/>
+        <w:sz w:val="20"/>
+      </w:rPr>
+    </w:lvl>
+    <w:lvl w:ilvl="3" w:tentative="1">
+      <w:start w:val="1"/>
+      <w:numFmt w:val="bullet"/>
+      <w:lvlText w:val=""/>
+      <w:lvlJc w:val="left"/>
+      <w:pPr>
+        <w:tabs>
+          <w:tab w:val="num" w:pos="2880"/>
+        </w:tabs>
+        <w:ind w:left="2880" w:hanging="360"/>
+      </w:pPr>
+      <w:rPr>
+        <w:rFonts w:ascii="Wingdings" w:hAnsi="Wingdings" w:hint="default"/>
+        <w:sz w:val="20"/>
+      </w:rPr>
+    </w:lvl>
+    <w:lvl w:ilvl="4" w:tentative="1">
+      <w:start w:val="1"/>
+      <w:numFmt w:val="bullet"/>
+      <w:lvlText w:val=""/>
+      <w:lvlJc w:val="left"/>
+      <w:pPr>
+        <w:tabs>
+          <w:tab w:val="num" w:pos="3600"/>
+        </w:tabs>
+        <w:ind w:left="3600" w:hanging="360"/>
+      </w:pPr>
+      <w:rPr>
+        <w:rFonts w:ascii="Wingdings" w:hAnsi="Wingdings" w:hint="default"/>
+        <w:sz w:val="20"/>
+      </w:rPr>
+    </w:lvl>
+    <w:lvl w:ilvl="5" w:tentative="1">
+      <w:start w:val="1"/>
+      <w:numFmt w:val="bullet"/>
+      <w:lvlText w:val=""/>
+      <w:lvlJc w:val="left"/>
+      <w:pPr>
+        <w:tabs>
+          <w:tab w:val="num" w:pos="4320"/>
+        </w:tabs>
+        <w:ind w:left="4320" w:hanging="360"/>
+      </w:pPr>
+      <w:rPr>
+        <w:rFonts w:ascii="Wingdings" w:hAnsi="Wingdings" w:hint="default"/>
+        <w:sz w:val="20"/>
+      </w:rPr>
+    </w:lvl>
+    <w:lvl w:ilvl="6" w:tentative="1">
+      <w:start w:val="1"/>
+      <w:numFmt w:val="bullet"/>
+      <w:lvlText w:val=""/>
+      <w:lvlJc w:val="left"/>
+      <w:pPr>
+        <w:tabs>
+          <w:tab w:val="num" w:pos="5040"/>
+        </w:tabs>
+        <w:ind w:left="5040" w:hanging="360"/>
+      </w:pPr>
+      <w:rPr>
+        <w:rFonts w:ascii="Wingdings" w:hAnsi="Wingdings" w:hint="default"/>
+        <w:sz w:val="20"/>
+      </w:rPr>
+    </w:lvl>
+    <w:lvl w:ilvl="7" w:tentative="1">
+      <w:start w:val="1"/>
+      <w:numFmt w:val="bullet"/>
+      <w:lvlText w:val=""/>
+      <w:lvlJc w:val="left"/>
+      <w:pPr>
+        <w:tabs>
+          <w:tab w:val="num" w:pos="5760"/>
+        </w:tabs>
+        <w:ind w:left="5760" w:hanging="360"/>
+      </w:pPr>
+      <w:rPr>
+        <w:rFonts w:ascii="Wingdings" w:hAnsi="Wingdings" w:hint="default"/>
+        <w:sz w:val="20"/>
+      </w:rPr>
+    </w:lvl>
+    <w:lvl w:ilvl="8" w:tentative="1">
+      <w:start w:val="1"/>
+      <w:numFmt w:val="bullet"/>
+      <w:lvlText w:val=""/>
+      <w:lvlJc w:val="left"/>
+      <w:pPr>
+        <w:tabs>
+          <w:tab w:val="num" w:pos="6480"/>
+        </w:tabs>
+        <w:ind w:left="6480" w:hanging="360"/>
+      </w:pPr>
+      <w:rPr>
+        <w:rFonts w:ascii="Wingdings" w:hAnsi="Wingdings" w:hint="default"/>
+        <w:sz w:val="20"/>
+      </w:rPr>
+    </w:lvl>
+  </w:abstractNum>
+  <w:abstractNum w:abstractNumId="10" w15:restartNumberingAfterBreak="0">
+    <w:nsid w:val="72921585"/>
+    <w:multiLevelType w:val="multilevel"/>
+    <w:tmpl w:val="AC3E7816"/>
     <w:lvl w:ilvl="0">
       <w:start w:val="1"/>
       <w:numFmt w:val="bullet"/>
@@ -2258,25 +3226,34 @@
     <w:abstractNumId w:val="1"/>
   </w:num>
   <w:num w:numId="2" w16cid:durableId="1298948826">
-    <w:abstractNumId w:val="7"/>
+    <w:abstractNumId w:val="9"/>
   </w:num>
   <w:num w:numId="3" w16cid:durableId="186988555">
     <w:abstractNumId w:val="0"/>
   </w:num>
   <w:num w:numId="4" w16cid:durableId="1998260807">
+    <w:abstractNumId w:val="5"/>
+  </w:num>
+  <w:num w:numId="5" w16cid:durableId="514343417">
+    <w:abstractNumId w:val="7"/>
+  </w:num>
+  <w:num w:numId="6" w16cid:durableId="240216609">
     <w:abstractNumId w:val="3"/>
   </w:num>
-  <w:num w:numId="5" w16cid:durableId="514343417">
-    <w:abstractNumId w:val="5"/>
+  <w:num w:numId="7" w16cid:durableId="666979712">
+    <w:abstractNumId w:val="6"/>
   </w:num>
-  <w:num w:numId="6" w16cid:durableId="240216609">
+  <w:num w:numId="8" w16cid:durableId="1095977390">
+    <w:abstractNumId w:val="8"/>
+  </w:num>
+  <w:num w:numId="9" w16cid:durableId="1440181986">
+    <w:abstractNumId w:val="4"/>
+  </w:num>
+  <w:num w:numId="10" w16cid:durableId="1831631866">
     <w:abstractNumId w:val="2"/>
   </w:num>
-  <w:num w:numId="7" w16cid:durableId="666979712">
-    <w:abstractNumId w:val="4"/>
-  </w:num>
-  <w:num w:numId="8" w16cid:durableId="1095977390">
-    <w:abstractNumId w:val="6"/>
+  <w:num w:numId="11" w16cid:durableId="1159660441">
+    <w:abstractNumId w:val="10"/>
   </w:num>
 </w:numbering>
 </file>

</xml_diff>